<commit_message>
3.1.D.A.2: prompt raspoznavaniya Razovoy arendy TS + fix A.1 (obrazec s Pdn vne git, shablony na A4)
</commit_message>
<xml_diff>
--- a/templates/shablon_arenda_ts_ip_with_vat.docx
+++ b/templates/shablon_arenda_ts_ip_with_vat.docx
@@ -44,18 +44,18 @@
     </w:p>
     <w:tbl>
       <w:tblPr>
-        <w:tblW w:type="dxa" w:w="9972"/>
+        <w:tblW w:type="dxa" w:w="9638"/>
         <w:tblLayout w:type="fixed"/>
         <w:tblLook w:firstColumn="1" w:firstRow="1" w:lastColumn="0" w:lastRow="0" w:noHBand="0" w:noVBand="1" w:val="04A0"/>
       </w:tblPr>
       <w:tblGrid>
-        <w:gridCol w:w="4986"/>
-        <w:gridCol w:w="4986"/>
+        <w:gridCol w:w="4819"/>
+        <w:gridCol w:w="4819"/>
       </w:tblGrid>
       <w:tr>
         <w:tc>
           <w:tcPr>
-            <w:tcW w:type="dxa" w:w="4986"/>
+            <w:tcW w:type="dxa" w:w="4819"/>
           </w:tcPr>
           <w:p>
             <w:pPr>
@@ -75,7 +75,7 @@
         </w:tc>
         <w:tc>
           <w:tcPr>
-            <w:tcW w:type="dxa" w:w="4986"/>
+            <w:tcW w:type="dxa" w:w="4819"/>
           </w:tcPr>
           <w:p>
             <w:pPr>
@@ -3266,18 +3266,18 @@
     <w:tbl>
       <w:tblPr>
         <w:tblStyle w:val="TableGrid"/>
-        <w:tblW w:type="dxa" w:w="9972"/>
+        <w:tblW w:type="dxa" w:w="9638"/>
         <w:tblLayout w:type="fixed"/>
         <w:tblLook w:firstColumn="1" w:firstRow="1" w:lastColumn="0" w:lastRow="0" w:noHBand="0" w:noVBand="1" w:val="04A0"/>
       </w:tblPr>
       <w:tblGrid>
-        <w:gridCol w:w="4986"/>
-        <w:gridCol w:w="4986"/>
+        <w:gridCol w:w="4819"/>
+        <w:gridCol w:w="4819"/>
       </w:tblGrid>
       <w:tr>
         <w:tc>
           <w:tcPr>
-            <w:tcW w:type="dxa" w:w="4986"/>
+            <w:tcW w:type="dxa" w:w="4819"/>
             <w:tcBorders>
               <w:top w:val="single" w:sz="8" w:space="0" w:color="000000"/>
               <w:left w:val="single" w:sz="8" w:space="0" w:color="000000"/>
@@ -3422,7 +3422,7 @@
         </w:tc>
         <w:tc>
           <w:tcPr>
-            <w:tcW w:type="dxa" w:w="4986"/>
+            <w:tcW w:type="dxa" w:w="4819"/>
             <w:tcBorders>
               <w:top w:val="single" w:sz="8" w:space="0" w:color="000000"/>
               <w:left w:val="single" w:sz="8" w:space="0" w:color="000000"/>
@@ -3660,18 +3660,18 @@
     <w:tbl>
       <w:tblPr>
         <w:tblStyle w:val="TableGrid"/>
-        <w:tblW w:type="dxa" w:w="9972"/>
+        <w:tblW w:type="dxa" w:w="9638"/>
         <w:tblLayout w:type="fixed"/>
         <w:tblLook w:firstColumn="1" w:firstRow="1" w:lastColumn="0" w:lastRow="0" w:noHBand="0" w:noVBand="1" w:val="04A0"/>
       </w:tblPr>
       <w:tblGrid>
-        <w:gridCol w:w="4490"/>
-        <w:gridCol w:w="5482"/>
+        <w:gridCol w:w="4341"/>
+        <w:gridCol w:w="5297"/>
       </w:tblGrid>
       <w:tr>
         <w:tc>
           <w:tcPr>
-            <w:tcW w:type="dxa" w:w="4490"/>
+            <w:tcW w:type="dxa" w:w="4341"/>
             <w:tcBorders>
               <w:top w:val="single" w:sz="8" w:space="0" w:color="000000"/>
               <w:left w:val="single" w:sz="8" w:space="0" w:color="000000"/>
@@ -3697,7 +3697,7 @@
         </w:tc>
         <w:tc>
           <w:tcPr>
-            <w:tcW w:type="dxa" w:w="5482"/>
+            <w:tcW w:type="dxa" w:w="5297"/>
             <w:tcBorders>
               <w:top w:val="single" w:sz="8" w:space="0" w:color="000000"/>
               <w:left w:val="single" w:sz="8" w:space="0" w:color="000000"/>
@@ -3716,7 +3716,7 @@
       <w:tr>
         <w:tc>
           <w:tcPr>
-            <w:tcW w:type="dxa" w:w="4490"/>
+            <w:tcW w:type="dxa" w:w="4341"/>
             <w:tcBorders>
               <w:top w:val="single" w:sz="8" w:space="0" w:color="000000"/>
               <w:left w:val="single" w:sz="8" w:space="0" w:color="000000"/>
@@ -3742,7 +3742,7 @@
         </w:tc>
         <w:tc>
           <w:tcPr>
-            <w:tcW w:type="dxa" w:w="5482"/>
+            <w:tcW w:type="dxa" w:w="5297"/>
             <w:tcBorders>
               <w:top w:val="single" w:sz="8" w:space="0" w:color="000000"/>
               <w:left w:val="single" w:sz="8" w:space="0" w:color="000000"/>
@@ -3761,7 +3761,7 @@
       <w:tr>
         <w:tc>
           <w:tcPr>
-            <w:tcW w:type="dxa" w:w="4490"/>
+            <w:tcW w:type="dxa" w:w="4341"/>
             <w:tcBorders>
               <w:top w:val="single" w:sz="8" w:space="0" w:color="000000"/>
               <w:left w:val="single" w:sz="8" w:space="0" w:color="000000"/>
@@ -3787,7 +3787,7 @@
         </w:tc>
         <w:tc>
           <w:tcPr>
-            <w:tcW w:type="dxa" w:w="5482"/>
+            <w:tcW w:type="dxa" w:w="5297"/>
             <w:tcBorders>
               <w:top w:val="single" w:sz="8" w:space="0" w:color="000000"/>
               <w:left w:val="single" w:sz="8" w:space="0" w:color="000000"/>
@@ -3815,7 +3815,7 @@
       <w:tr>
         <w:tc>
           <w:tcPr>
-            <w:tcW w:type="dxa" w:w="4490"/>
+            <w:tcW w:type="dxa" w:w="4341"/>
             <w:tcBorders>
               <w:top w:val="single" w:sz="8" w:space="0" w:color="000000"/>
               <w:left w:val="single" w:sz="8" w:space="0" w:color="000000"/>
@@ -3841,7 +3841,7 @@
         </w:tc>
         <w:tc>
           <w:tcPr>
-            <w:tcW w:type="dxa" w:w="5482"/>
+            <w:tcW w:type="dxa" w:w="5297"/>
             <w:tcBorders>
               <w:top w:val="single" w:sz="8" w:space="0" w:color="000000"/>
               <w:left w:val="single" w:sz="8" w:space="0" w:color="000000"/>
@@ -3869,7 +3869,7 @@
       <w:tr>
         <w:tc>
           <w:tcPr>
-            <w:tcW w:type="dxa" w:w="4490"/>
+            <w:tcW w:type="dxa" w:w="4341"/>
             <w:tcBorders>
               <w:top w:val="single" w:sz="8" w:space="0" w:color="000000"/>
               <w:left w:val="single" w:sz="8" w:space="0" w:color="000000"/>
@@ -3895,7 +3895,7 @@
         </w:tc>
         <w:tc>
           <w:tcPr>
-            <w:tcW w:type="dxa" w:w="5482"/>
+            <w:tcW w:type="dxa" w:w="5297"/>
             <w:tcBorders>
               <w:top w:val="single" w:sz="8" w:space="0" w:color="000000"/>
               <w:left w:val="single" w:sz="8" w:space="0" w:color="000000"/>
@@ -3914,7 +3914,7 @@
       <w:tr>
         <w:tc>
           <w:tcPr>
-            <w:tcW w:type="dxa" w:w="4490"/>
+            <w:tcW w:type="dxa" w:w="4341"/>
             <w:tcBorders>
               <w:top w:val="single" w:sz="8" w:space="0" w:color="000000"/>
               <w:left w:val="single" w:sz="8" w:space="0" w:color="000000"/>
@@ -3940,7 +3940,7 @@
         </w:tc>
         <w:tc>
           <w:tcPr>
-            <w:tcW w:type="dxa" w:w="5482"/>
+            <w:tcW w:type="dxa" w:w="5297"/>
             <w:tcBorders>
               <w:top w:val="single" w:sz="8" w:space="0" w:color="000000"/>
               <w:left w:val="single" w:sz="8" w:space="0" w:color="000000"/>
@@ -3959,7 +3959,7 @@
       <w:tr>
         <w:tc>
           <w:tcPr>
-            <w:tcW w:type="dxa" w:w="4490"/>
+            <w:tcW w:type="dxa" w:w="4341"/>
             <w:tcBorders>
               <w:top w:val="single" w:sz="8" w:space="0" w:color="000000"/>
               <w:left w:val="single" w:sz="8" w:space="0" w:color="000000"/>
@@ -3985,7 +3985,7 @@
         </w:tc>
         <w:tc>
           <w:tcPr>
-            <w:tcW w:type="dxa" w:w="5482"/>
+            <w:tcW w:type="dxa" w:w="5297"/>
             <w:tcBorders>
               <w:top w:val="single" w:sz="8" w:space="0" w:color="000000"/>
               <w:left w:val="single" w:sz="8" w:space="0" w:color="000000"/>
@@ -4013,7 +4013,7 @@
       <w:tr>
         <w:tc>
           <w:tcPr>
-            <w:tcW w:type="dxa" w:w="4490"/>
+            <w:tcW w:type="dxa" w:w="4341"/>
             <w:tcBorders>
               <w:top w:val="single" w:sz="8" w:space="0" w:color="000000"/>
               <w:left w:val="single" w:sz="8" w:space="0" w:color="000000"/>
@@ -4039,7 +4039,7 @@
         </w:tc>
         <w:tc>
           <w:tcPr>
-            <w:tcW w:type="dxa" w:w="5482"/>
+            <w:tcW w:type="dxa" w:w="5297"/>
             <w:tcBorders>
               <w:top w:val="single" w:sz="8" w:space="0" w:color="000000"/>
               <w:left w:val="single" w:sz="8" w:space="0" w:color="000000"/>
@@ -4097,18 +4097,18 @@
     <w:tbl>
       <w:tblPr>
         <w:tblStyle w:val="TableGrid"/>
-        <w:tblW w:type="dxa" w:w="9972"/>
+        <w:tblW w:type="dxa" w:w="9638"/>
         <w:tblLayout w:type="fixed"/>
         <w:tblLook w:firstColumn="1" w:firstRow="1" w:lastColumn="0" w:lastRow="0" w:noHBand="0" w:noVBand="1" w:val="04A0"/>
       </w:tblPr>
       <w:tblGrid>
-        <w:gridCol w:w="4490"/>
-        <w:gridCol w:w="5482"/>
+        <w:gridCol w:w="4341"/>
+        <w:gridCol w:w="5297"/>
       </w:tblGrid>
       <w:tr>
         <w:tc>
           <w:tcPr>
-            <w:tcW w:type="dxa" w:w="4490"/>
+            <w:tcW w:type="dxa" w:w="4341"/>
             <w:tcBorders>
               <w:top w:val="single" w:sz="8" w:space="0" w:color="000000"/>
               <w:left w:val="single" w:sz="8" w:space="0" w:color="000000"/>
@@ -4134,7 +4134,7 @@
         </w:tc>
         <w:tc>
           <w:tcPr>
-            <w:tcW w:type="dxa" w:w="5482"/>
+            <w:tcW w:type="dxa" w:w="5297"/>
             <w:tcBorders>
               <w:top w:val="single" w:sz="8" w:space="0" w:color="000000"/>
               <w:left w:val="single" w:sz="8" w:space="0" w:color="000000"/>
@@ -4153,7 +4153,7 @@
       <w:tr>
         <w:tc>
           <w:tcPr>
-            <w:tcW w:type="dxa" w:w="4490"/>
+            <w:tcW w:type="dxa" w:w="4341"/>
             <w:tcBorders>
               <w:top w:val="single" w:sz="8" w:space="0" w:color="000000"/>
               <w:left w:val="single" w:sz="8" w:space="0" w:color="000000"/>
@@ -4179,7 +4179,7 @@
         </w:tc>
         <w:tc>
           <w:tcPr>
-            <w:tcW w:type="dxa" w:w="5482"/>
+            <w:tcW w:type="dxa" w:w="5297"/>
             <w:tcBorders>
               <w:top w:val="single" w:sz="8" w:space="0" w:color="000000"/>
               <w:left w:val="single" w:sz="8" w:space="0" w:color="000000"/>
@@ -4198,7 +4198,7 @@
       <w:tr>
         <w:tc>
           <w:tcPr>
-            <w:tcW w:type="dxa" w:w="4490"/>
+            <w:tcW w:type="dxa" w:w="4341"/>
             <w:tcBorders>
               <w:top w:val="single" w:sz="8" w:space="0" w:color="000000"/>
               <w:left w:val="single" w:sz="8" w:space="0" w:color="000000"/>
@@ -4224,7 +4224,7 @@
         </w:tc>
         <w:tc>
           <w:tcPr>
-            <w:tcW w:type="dxa" w:w="5482"/>
+            <w:tcW w:type="dxa" w:w="5297"/>
             <w:tcBorders>
               <w:top w:val="single" w:sz="8" w:space="0" w:color="000000"/>
               <w:left w:val="single" w:sz="8" w:space="0" w:color="000000"/>
@@ -4243,7 +4243,7 @@
       <w:tr>
         <w:tc>
           <w:tcPr>
-            <w:tcW w:type="dxa" w:w="4490"/>
+            <w:tcW w:type="dxa" w:w="4341"/>
             <w:tcBorders>
               <w:top w:val="single" w:sz="8" w:space="0" w:color="000000"/>
               <w:left w:val="single" w:sz="8" w:space="0" w:color="000000"/>
@@ -4269,7 +4269,7 @@
         </w:tc>
         <w:tc>
           <w:tcPr>
-            <w:tcW w:type="dxa" w:w="5482"/>
+            <w:tcW w:type="dxa" w:w="5297"/>
             <w:tcBorders>
               <w:top w:val="single" w:sz="8" w:space="0" w:color="000000"/>
               <w:left w:val="single" w:sz="8" w:space="0" w:color="000000"/>
@@ -4288,7 +4288,7 @@
       <w:tr>
         <w:tc>
           <w:tcPr>
-            <w:tcW w:type="dxa" w:w="4490"/>
+            <w:tcW w:type="dxa" w:w="4341"/>
             <w:tcBorders>
               <w:top w:val="single" w:sz="8" w:space="0" w:color="000000"/>
               <w:left w:val="single" w:sz="8" w:space="0" w:color="000000"/>
@@ -4314,7 +4314,7 @@
         </w:tc>
         <w:tc>
           <w:tcPr>
-            <w:tcW w:type="dxa" w:w="5482"/>
+            <w:tcW w:type="dxa" w:w="5297"/>
             <w:tcBorders>
               <w:top w:val="single" w:sz="8" w:space="0" w:color="000000"/>
               <w:left w:val="single" w:sz="8" w:space="0" w:color="000000"/>
@@ -4349,18 +4349,18 @@
     <w:tbl>
       <w:tblPr>
         <w:tblStyle w:val="TableGrid"/>
-        <w:tblW w:type="dxa" w:w="9972"/>
+        <w:tblW w:type="dxa" w:w="9638"/>
         <w:tblLayout w:type="fixed"/>
         <w:tblLook w:firstColumn="1" w:firstRow="1" w:lastColumn="0" w:lastRow="0" w:noHBand="0" w:noVBand="1" w:val="04A0"/>
       </w:tblPr>
       <w:tblGrid>
-        <w:gridCol w:w="4986"/>
-        <w:gridCol w:w="4986"/>
+        <w:gridCol w:w="4819"/>
+        <w:gridCol w:w="4819"/>
       </w:tblGrid>
       <w:tr>
         <w:tc>
           <w:tcPr>
-            <w:tcW w:type="dxa" w:w="4986"/>
+            <w:tcW w:type="dxa" w:w="4819"/>
             <w:tcBorders>
               <w:top w:val="single" w:sz="8" w:space="0" w:color="000000"/>
               <w:left w:val="single" w:sz="8" w:space="0" w:color="000000"/>
@@ -4416,7 +4416,7 @@
         </w:tc>
         <w:tc>
           <w:tcPr>
-            <w:tcW w:type="dxa" w:w="4986"/>
+            <w:tcW w:type="dxa" w:w="4819"/>
             <w:tcBorders>
               <w:top w:val="single" w:sz="8" w:space="0" w:color="000000"/>
               <w:left w:val="single" w:sz="8" w:space="0" w:color="000000"/>
@@ -4473,7 +4473,7 @@
       </w:tr>
     </w:tbl>
     <w:sectPr>
-      <w:pgSz w:w="12240" w:h="15840"/>
+      <w:pgSz w:w="11906" w:h="16838"/>
       <w:pgMar w:top="964" w:right="1134" w:bottom="964" w:left="1134" w:header="720" w:footer="720" w:gutter="0"/>
       <w:cols w:space="720"/>
       <w:docGrid w:linePitch="360"/>

</xml_diff>

<commit_message>
FIX-1-T: аренда ТС — п. 3.3.2 == planned_completion_date, п. 4.5 == payment_days + STATE.md
</commit_message>
<xml_diff>
--- a/templates/shablon_arenda_ts_ip_with_vat.docx
+++ b/templates/shablon_arenda_ts_ip_with_vat.docx
@@ -2046,7 +2046,25 @@
           <w:sz w:val="21"/>
           <w:u w:val="none"/>
         </w:rPr>
-        <w:t>{{unloading_1_address}}. Плановая дата завершения: {{unloading_1_date}} г.</w:t>
+        <w:t xml:space="preserve">{{unloading_1_address}}. Плановая дата завершения: </w:t>
+      </w:r>
+      <w:r>
+        <w:rPr>
+          <w:rFonts w:ascii="Times New Roman" w:hAnsi="Times New Roman" w:cs="Times New Roman" w:eastAsia="Times New Roman"/>
+          <w:b w:val="0"/>
+          <w:sz w:val="21"/>
+          <w:u w:val="none"/>
+        </w:rPr>
+        <w:t>{{unloading_1_date}}</w:t>
+      </w:r>
+      <w:r>
+        <w:rPr>
+          <w:rFonts w:ascii="Times New Roman" w:hAnsi="Times New Roman" w:cs="Times New Roman" w:eastAsia="Times New Roman"/>
+          <w:b w:val="0"/>
+          <w:sz w:val="21"/>
+          <w:u w:val="none"/>
+        </w:rPr>
+        <w:t xml:space="preserve"> г.</w:t>
       </w:r>
     </w:p>
     <w:p>
@@ -2070,7 +2088,25 @@
           <w:sz w:val="21"/>
           <w:u w:val="none"/>
         </w:rPr>
-        <w:t>{{unloading_2_address}}. Плановая дата завершения: {{unloading_2_date}} г.</w:t>
+        <w:t xml:space="preserve">{{unloading_2_address}}. Плановая дата завершения: </w:t>
+      </w:r>
+      <w:r>
+        <w:rPr>
+          <w:rFonts w:ascii="Times New Roman" w:hAnsi="Times New Roman" w:cs="Times New Roman" w:eastAsia="Times New Roman"/>
+          <w:b w:val="0"/>
+          <w:sz w:val="21"/>
+          <w:u w:val="none"/>
+        </w:rPr>
+        <w:t>{{planned_completion_date}}</w:t>
+      </w:r>
+      <w:r>
+        <w:rPr>
+          <w:rFonts w:ascii="Times New Roman" w:hAnsi="Times New Roman" w:cs="Times New Roman" w:eastAsia="Times New Roman"/>
+          <w:b w:val="0"/>
+          <w:sz w:val="21"/>
+          <w:u w:val="none"/>
+        </w:rPr>
+        <w:t xml:space="preserve"> г.</w:t>
       </w:r>
     </w:p>
     <w:p>
@@ -2094,7 +2130,25 @@
           <w:sz w:val="21"/>
           <w:u w:val="none"/>
         </w:rPr>
-        <w:t>{{unloading_3_address}}. Плановая дата завершения: {{unloading_3_date}} г.</w:t>
+        <w:t xml:space="preserve">{{unloading_3_address}}. Плановая дата завершения: </w:t>
+      </w:r>
+      <w:r>
+        <w:rPr>
+          <w:rFonts w:ascii="Times New Roman" w:hAnsi="Times New Roman" w:cs="Times New Roman" w:eastAsia="Times New Roman"/>
+          <w:b w:val="0"/>
+          <w:sz w:val="21"/>
+          <w:u w:val="none"/>
+        </w:rPr>
+        <w:t>{{unloading_3_date}}</w:t>
+      </w:r>
+      <w:r>
+        <w:rPr>
+          <w:rFonts w:ascii="Times New Roman" w:hAnsi="Times New Roman" w:cs="Times New Roman" w:eastAsia="Times New Roman"/>
+          <w:b w:val="0"/>
+          <w:sz w:val="21"/>
+          <w:u w:val="none"/>
+        </w:rPr>
+        <w:t xml:space="preserve"> г.</w:t>
       </w:r>
     </w:p>
     <w:p>
@@ -2118,7 +2172,25 @@
           <w:sz w:val="21"/>
           <w:u w:val="none"/>
         </w:rPr>
-        <w:t>{{unloading_4_address}}. Плановая дата завершения: {{unloading_4_date}} г.</w:t>
+        <w:t xml:space="preserve">{{unloading_4_address}}. Плановая дата завершения: </w:t>
+      </w:r>
+      <w:r>
+        <w:rPr>
+          <w:rFonts w:ascii="Times New Roman" w:hAnsi="Times New Roman" w:cs="Times New Roman" w:eastAsia="Times New Roman"/>
+          <w:b w:val="0"/>
+          <w:sz w:val="21"/>
+          <w:u w:val="none"/>
+        </w:rPr>
+        <w:t>{{unloading_4_date}}</w:t>
+      </w:r>
+      <w:r>
+        <w:rPr>
+          <w:rFonts w:ascii="Times New Roman" w:hAnsi="Times New Roman" w:cs="Times New Roman" w:eastAsia="Times New Roman"/>
+          <w:b w:val="0"/>
+          <w:sz w:val="21"/>
+          <w:u w:val="none"/>
+        </w:rPr>
+        <w:t xml:space="preserve"> г.</w:t>
       </w:r>
     </w:p>
     <w:p>
@@ -2142,7 +2214,25 @@
           <w:sz w:val="21"/>
           <w:u w:val="none"/>
         </w:rPr>
-        <w:t>{{unloading_5_address}}. Плановая дата завершения: {{unloading_5_date}} г.</w:t>
+        <w:t xml:space="preserve">{{unloading_5_address}}. Плановая дата завершения: </w:t>
+      </w:r>
+      <w:r>
+        <w:rPr>
+          <w:rFonts w:ascii="Times New Roman" w:hAnsi="Times New Roman" w:cs="Times New Roman" w:eastAsia="Times New Roman"/>
+          <w:b w:val="0"/>
+          <w:sz w:val="21"/>
+          <w:u w:val="none"/>
+        </w:rPr>
+        <w:t>{{unloading_5_date}}</w:t>
+      </w:r>
+      <w:r>
+        <w:rPr>
+          <w:rFonts w:ascii="Times New Roman" w:hAnsi="Times New Roman" w:cs="Times New Roman" w:eastAsia="Times New Roman"/>
+          <w:b w:val="0"/>
+          <w:sz w:val="21"/>
+          <w:u w:val="none"/>
+        </w:rPr>
+        <w:t xml:space="preserve"> г.</w:t>
       </w:r>
     </w:p>
     <w:p>
@@ -2166,7 +2256,25 @@
           <w:sz w:val="21"/>
           <w:u w:val="none"/>
         </w:rPr>
-        <w:t>{{unloading_6_address}}. Плановая дата завершения: {{unloading_6_date}} г.</w:t>
+        <w:t xml:space="preserve">{{unloading_6_address}}. Плановая дата завершения: </w:t>
+      </w:r>
+      <w:r>
+        <w:rPr>
+          <w:rFonts w:ascii="Times New Roman" w:hAnsi="Times New Roman" w:cs="Times New Roman" w:eastAsia="Times New Roman"/>
+          <w:b w:val="0"/>
+          <w:sz w:val="21"/>
+          <w:u w:val="none"/>
+        </w:rPr>
+        <w:t>{{unloading_6_date}}</w:t>
+      </w:r>
+      <w:r>
+        <w:rPr>
+          <w:rFonts w:ascii="Times New Roman" w:hAnsi="Times New Roman" w:cs="Times New Roman" w:eastAsia="Times New Roman"/>
+          <w:b w:val="0"/>
+          <w:sz w:val="21"/>
+          <w:u w:val="none"/>
+        </w:rPr>
+        <w:t xml:space="preserve"> г.</w:t>
       </w:r>
     </w:p>
     <w:p>
@@ -2190,7 +2298,25 @@
           <w:sz w:val="21"/>
           <w:u w:val="none"/>
         </w:rPr>
-        <w:t>{{unloading_7_address}}. Плановая дата завершения: {{unloading_7_date}} г.</w:t>
+        <w:t xml:space="preserve">{{unloading_7_address}}. Плановая дата завершения: </w:t>
+      </w:r>
+      <w:r>
+        <w:rPr>
+          <w:rFonts w:ascii="Times New Roman" w:hAnsi="Times New Roman" w:cs="Times New Roman" w:eastAsia="Times New Roman"/>
+          <w:b w:val="0"/>
+          <w:sz w:val="21"/>
+          <w:u w:val="none"/>
+        </w:rPr>
+        <w:t>{{unloading_7_date}}</w:t>
+      </w:r>
+      <w:r>
+        <w:rPr>
+          <w:rFonts w:ascii="Times New Roman" w:hAnsi="Times New Roman" w:cs="Times New Roman" w:eastAsia="Times New Roman"/>
+          <w:b w:val="0"/>
+          <w:sz w:val="21"/>
+          <w:u w:val="none"/>
+        </w:rPr>
+        <w:t xml:space="preserve"> г.</w:t>
       </w:r>
     </w:p>
     <w:p>
@@ -2214,7 +2340,25 @@
           <w:sz w:val="21"/>
           <w:u w:val="none"/>
         </w:rPr>
-        <w:t>{{unloading_8_address}}. Плановая дата завершения: {{unloading_8_date}} г.</w:t>
+        <w:t xml:space="preserve">{{unloading_8_address}}. Плановая дата завершения: </w:t>
+      </w:r>
+      <w:r>
+        <w:rPr>
+          <w:rFonts w:ascii="Times New Roman" w:hAnsi="Times New Roman" w:cs="Times New Roman" w:eastAsia="Times New Roman"/>
+          <w:b w:val="0"/>
+          <w:sz w:val="21"/>
+          <w:u w:val="none"/>
+        </w:rPr>
+        <w:t>{{unloading_8_date}}</w:t>
+      </w:r>
+      <w:r>
+        <w:rPr>
+          <w:rFonts w:ascii="Times New Roman" w:hAnsi="Times New Roman" w:cs="Times New Roman" w:eastAsia="Times New Roman"/>
+          <w:b w:val="0"/>
+          <w:sz w:val="21"/>
+          <w:u w:val="none"/>
+        </w:rPr>
+        <w:t xml:space="preserve"> г.</w:t>
       </w:r>
     </w:p>
     <w:p>
@@ -2238,7 +2382,25 @@
           <w:sz w:val="21"/>
           <w:u w:val="none"/>
         </w:rPr>
-        <w:t>{{unloading_9_address}}. Плановая дата завершения: {{unloading_9_date}} г.</w:t>
+        <w:t xml:space="preserve">{{unloading_9_address}}. Плановая дата завершения: </w:t>
+      </w:r>
+      <w:r>
+        <w:rPr>
+          <w:rFonts w:ascii="Times New Roman" w:hAnsi="Times New Roman" w:cs="Times New Roman" w:eastAsia="Times New Roman"/>
+          <w:b w:val="0"/>
+          <w:sz w:val="21"/>
+          <w:u w:val="none"/>
+        </w:rPr>
+        <w:t>{{unloading_9_date}}</w:t>
+      </w:r>
+      <w:r>
+        <w:rPr>
+          <w:rFonts w:ascii="Times New Roman" w:hAnsi="Times New Roman" w:cs="Times New Roman" w:eastAsia="Times New Roman"/>
+          <w:b w:val="0"/>
+          <w:sz w:val="21"/>
+          <w:u w:val="none"/>
+        </w:rPr>
+        <w:t xml:space="preserve"> г.</w:t>
       </w:r>
     </w:p>
     <w:p>
@@ -2262,7 +2424,25 @@
           <w:sz w:val="21"/>
           <w:u w:val="none"/>
         </w:rPr>
-        <w:t>{{unloading_10_address}}. Плановая дата завершения: {{unloading_10_date}} г.</w:t>
+        <w:t xml:space="preserve">{{unloading_10_address}}. Плановая дата завершения: </w:t>
+      </w:r>
+      <w:r>
+        <w:rPr>
+          <w:rFonts w:ascii="Times New Roman" w:hAnsi="Times New Roman" w:cs="Times New Roman" w:eastAsia="Times New Roman"/>
+          <w:b w:val="0"/>
+          <w:sz w:val="21"/>
+          <w:u w:val="none"/>
+        </w:rPr>
+        <w:t>{{unloading_10_date}}</w:t>
+      </w:r>
+      <w:r>
+        <w:rPr>
+          <w:rFonts w:ascii="Times New Roman" w:hAnsi="Times New Roman" w:cs="Times New Roman" w:eastAsia="Times New Roman"/>
+          <w:b w:val="0"/>
+          <w:sz w:val="21"/>
+          <w:u w:val="none"/>
+        </w:rPr>
+        <w:t xml:space="preserve"> г.</w:t>
       </w:r>
     </w:p>
     <w:p>
@@ -2635,7 +2815,25 @@
           <w:sz w:val="21"/>
           <w:u w:val="none"/>
         </w:rPr>
-        <w:t>4.5. Оплата производится в течение 30 (тридцати) банковских дней с даты фактического возврата ТС и получения Арендатором последнего из обязательных надлежащим образом оформленных расчетных и закрывающих документов, в том числе через ЭДО.</w:t>
+        <w:t xml:space="preserve">4.5. Оплата производится в течение </w:t>
+      </w:r>
+      <w:r>
+        <w:rPr>
+          <w:rFonts w:ascii="Times New Roman" w:hAnsi="Times New Roman" w:cs="Times New Roman" w:eastAsia="Times New Roman"/>
+          <w:b w:val="0"/>
+          <w:sz w:val="21"/>
+          <w:u w:val="none"/>
+        </w:rPr>
+        <w:t>{{payment_days}}</w:t>
+      </w:r>
+      <w:r>
+        <w:rPr>
+          <w:rFonts w:ascii="Times New Roman" w:hAnsi="Times New Roman" w:cs="Times New Roman" w:eastAsia="Times New Roman"/>
+          <w:b w:val="0"/>
+          <w:sz w:val="21"/>
+          <w:u w:val="none"/>
+        </w:rPr>
+        <w:t xml:space="preserve"> ({{payment_days_words}}) банковских дней с даты фактического возврата ТС и получения Арендатором последнего из обязательных надлежащим образом оформленных расчетных и закрывающих документов, в том числе через ЭДО.</w:t>
       </w:r>
     </w:p>
     <w:p>

</xml_diff>